<commit_message>
Update Lab 3 deliverables to use the Municipal App problem statement
</commit_message>
<xml_diff>
--- a/SELABS/Lab3/Architectural_Justification.docx
+++ b/SELABS/Lab3/Architectural_Justification.docx
@@ -7,7 +7,7 @@
         <w:pStyle w:val="Heading1"/>
       </w:pPr>
       <w:r>
-        <w:t>Architecture Selection Justification</w:t>
+        <w:t>Architecture Selection Justification - Smart Cities Municipal App</w:t>
       </w:r>
     </w:p>
     <w:p>
@@ -18,10 +18,10 @@
         <w:rPr>
           <w:b/>
         </w:rPr>
-        <w:t>Layered Architecture</w:t>
+        <w:t>Layered Microservices Architecture</w:t>
       </w:r>
       <w:r>
-        <w:t xml:space="preserve"> for the Self-Service Coffee Kiosk System."</w:t>
+        <w:t xml:space="preserve"> for the Smart Cities Municipal Infrastructure Damage Reporting App."</w:t>
       </w:r>
     </w:p>
     <w:p>
@@ -32,7 +32,7 @@
         <w:t xml:space="preserve">Architectural Choice: </w:t>
       </w:r>
       <w:r>
-        <w:t>Layered Architecture</w:t>
+        <w:t>Layered Microservices Architecture</w:t>
       </w:r>
     </w:p>
     <w:p>
@@ -48,7 +48,7 @@
         <w:pStyle w:val="ListBullet"/>
       </w:pPr>
       <w:r>
-        <w:t>Separation of Concerns: It neatly decouples the user-facing touch screen interface (Presentation Layer) from the business logic (Order and Payment Management) and data storage (Menu/Pricing). This makes the system easier to maintain and update over time.</w:t>
+        <w:t>Scalability: A municipal app can have a high volume of traffic during severe weather events (e.g., storms causing multiple potholes). Microservices allow scaling specific components (like the Ticket Management Service) independently of the User Interface.</w:t>
       </w:r>
     </w:p>
     <w:p>
@@ -56,7 +56,7 @@
         <w:pStyle w:val="ListBullet"/>
       </w:pPr>
       <w:r>
-        <w:t>Hardware Isolation: The architecture isolates hardware-specific integrations (like the touch screen and receipt printer) into specific layers. If a printer model changes, only the Receipt Printer Component in the Business Layer needs updating, without affecting the UI or database.</w:t>
+        <w:t>Fault Tolerance &amp; Offline Support: The architecture allows the Mobile App Component to queue reports locally while offline and sync them to the Ticket Management Service once connectivity is restored.</w:t>
       </w:r>
     </w:p>
     <w:p>
@@ -67,7 +67,7 @@
         <w:t>Security Advantage:</w:t>
       </w:r>
       <w:r>
-        <w:t xml:space="preserve"> The layered approach inherently restricts direct access from the Presentation Layer to the Data Layer. All interactions must flow through the Business Layer (Order Manager and Payment Service). This allows the Payment Service Component to securely process credit card transactions and validate inputs before any data is recorded, minimizing the risk of unauthorized database access or injection attacks.</w:t>
+        <w:t xml:space="preserve"> By adopting a layered microservices approach, sensitive citizen data (like GPS locations and contact info) is encapsulated within the Data Layer. It can only be accessed through authenticated API calls via the Business Logic Layer. This mitigates unauthorized data extraction and ensures strict access control between Citizens and Municipal Engineers.</w:t>
       </w:r>
     </w:p>
     <w:p>
@@ -78,7 +78,7 @@
         <w:t>Performance Benefit:</w:t>
       </w:r>
       <w:r>
-        <w:t xml:space="preserve"> Since the system handles a fixed set of options (3 coffee types, 2 sizes), the Business Layer can cache menu and pricing information retrieved from the Data Layer. This reduces the number of database queries required during order customization, leading to a faster and more responsive touch screen experience for customers in a busy café environment.</w:t>
+        <w:t xml:space="preserve"> The separation of heavy operations, such as GPS metadata extraction and image processing, into dedicated microservices prevents the main reporting workflow from slowing down. Asynchronous ticket dispatching ensures citizens receive instant confirmation while backend routing happens in the background.</w:t>
       </w:r>
     </w:p>
     <w:sectPr>

</xml_diff>